<commit_message>
[minor] ops/sla_kwartal: quarterly subcontractor SLA signing — invite D0, reminders D+3/D+6, block notice D+9, block from quarter start; OM in CC; Drive archive; switches off (dry-run)
No lawyer (Norbert 28.10): client contract + sub-SLA built from existing network SLAs. Scope W.6 owner, new W.10. 9 tests green; launchd com.pbs.arkpol-sla-kwartal 08:30.

Co-Authored-By: Claude Opus 5.5 <noreply@anthropic.com>
</commit_message>
<xml_diff>
--- a/docs/UMOWA_KLIENT_STANDARD_USLUGI_LISTA_OM.docx
+++ b/docs/UMOWA_KLIENT_STANDARD_USLUGI_LISTA_OM.docx
@@ -20,7 +20,7 @@
           <w:b/>
           <w:bCs/>
         </w:rPr>
-        <w:t xml:space="preserve">2026-10-28 · zadanie W.6 / W.7 (FAZA W w</w:t>
+        <w:t xml:space="preserve">2026-10-28 · prawnik nic nie pisze: bierzemy istniejące SLA sieci i je dostosowujemy (decyzja Norberta) · zadanie W.6 / W.7 (FAZA W w</w:t>
       </w:r>
       <w:r>
         <w:rPr>
@@ -394,7 +394,7 @@
               <w:pStyle w:val="Compact"/>
             </w:pPr>
             <w:r>
-              <w:t xml:space="preserve">punkt startu dla prawnika (pytanie P31)</w:t>
+              <w:t xml:space="preserve">punkt startu wzoru (pytanie P31)</w:t>
             </w:r>
           </w:p>
         </w:tc>
@@ -973,43 +973,58 @@
                 <w:b/>
                 <w:bCs/>
               </w:rPr>
-              <w:t xml:space="preserve">Prawnik</w:t>
-            </w:r>
-            <w:r>
-              <w:t xml:space="preserve">: z jaką kancelarią pracuje Arkpol, kontakt, czy prowadzi sprawy konsumenckie</w:t>
-            </w:r>
-          </w:p>
-        </w:tc>
-        <w:tc>
-          <w:tcPr/>
-          <w:p>
-            <w:pPr>
-              <w:pStyle w:val="Compact"/>
-            </w:pPr>
-            <w:r>
-              <w:t xml:space="preserve">Prezes / Norbert</w:t>
-            </w:r>
-          </w:p>
-        </w:tc>
-        <w:tc>
-          <w:tcPr/>
-          <w:p>
-            <w:pPr>
-              <w:pStyle w:val="Compact"/>
-            </w:pPr>
-            <w:r>
-              <w:t xml:space="preserve">przegląd wzoru (W.6)</w:t>
-            </w:r>
-          </w:p>
-        </w:tc>
-        <w:tc>
-          <w:tcPr/>
-          <w:p>
-            <w:pPr>
-              <w:pStyle w:val="Compact"/>
-            </w:pPr>
-            <w:r>
-              <w:t xml:space="preserve">☐</w:t>
+              <w:t xml:space="preserve">Podwykonawcy: SLA kwartalne.</w:t>
+            </w:r>
+            <w:r>
+              <w:t xml:space="preserve"> </w:t>
+            </w:r>
+            <w:r>
+              <w:t xml:space="preserve">Office Manager jest w DW każdego maila automatu (zaproszenie, 2 przypomnienia, informacja o blokadzie). Sprawdza, czy podpisane SLA są w folderze kwartału na Dysku. Kto nie podpisał, ten od pierwszego dnia kwartału nie dostaje nowych zleceń: przekazać to MM.</w:t>
+            </w:r>
+          </w:p>
+        </w:tc>
+        <w:tc>
+          <w:tcPr/>
+          <w:p>
+            <w:pPr>
+              <w:pStyle w:val="Compact"/>
+            </w:pPr>
+            <w:r>
+              <w:t xml:space="preserve">automat</w:t>
+            </w:r>
+            <w:r>
+              <w:t xml:space="preserve"> </w:t>
+            </w:r>
+            <w:r>
+              <w:rPr>
+                <w:rStyle w:val="VerbatimChar"/>
+              </w:rPr>
+              <w:t xml:space="preserve">ops/sla_kwartal</w:t>
+            </w:r>
+            <w:r>
+              <w:t xml:space="preserve">, Dysk</w:t>
+            </w:r>
+          </w:p>
+        </w:tc>
+        <w:tc>
+          <w:tcPr/>
+          <w:p>
+            <w:pPr>
+              <w:pStyle w:val="Compact"/>
+            </w:pPr>
+            <w:r>
+              <w:t xml:space="preserve">dzięki temu obietnice z umowy klienta są pokryte przez podwykonawców</w:t>
+            </w:r>
+          </w:p>
+        </w:tc>
+        <w:tc>
+          <w:tcPr/>
+          <w:p>
+            <w:pPr>
+              <w:pStyle w:val="Compact"/>
+            </w:pPr>
+            <w:r>
+              <w:t xml:space="preserve">co kwartał</w:t>
             </w:r>
           </w:p>
         </w:tc>
@@ -1306,7 +1321,7 @@
         <w:t xml:space="preserve">Odpowiedzialność i ubezpieczenie</w:t>
       </w:r>
       <w:r>
-        <w:t xml:space="preserve">: jedno zdanie, treść po A5 i decyzji prawnika.</w:t>
+        <w:t xml:space="preserve">: jedno zdanie, treść po A5 (polisy) i decyzji Norberta.</w:t>
       </w:r>
     </w:p>
     <w:p>
@@ -1328,7 +1343,7 @@
         <w:t xml:space="preserve"> </w:t>
       </w:r>
       <w:r>
-        <w:t xml:space="preserve">(wymóg ustawy dla konsumenta, umowa zawarta na odległość): wzór formularza w załączniku. Prawnik ustala, jak to pogodzić z terminem przeprowadzki.</w:t>
+        <w:t xml:space="preserve">(wymóg ustawy dla konsumenta, umowa zawarta na odległość): wzór formularza w załączniku. Klient w kreatorze prosi o rozpoczęcie usługi przed upływem 14 dni i przyjmuje do wiadomości, że po pełnym wykonaniu usługi traci prawo odstąpienia (art. 38 ustawy o prawach konsumenta).</w:t>
       </w:r>
     </w:p>
     <w:p>
@@ -2062,7 +2077,7 @@
               <w:t xml:space="preserve">[●]</w:t>
             </w:r>
             <w:r>
-              <w:t xml:space="preserve">. Prawnik potwierdzi termin ustawowy; w Prawie przewozowym dla szkód niewidocznych to 7 dni.</w:t>
+              <w:t xml:space="preserve">. Proponowany termin to 7 dni (art. 76 Prawa przewozowego).</w:t>
             </w:r>
           </w:p>
         </w:tc>

</xml_diff>